<commit_message>
Hoan thanh bai 1
</commit_message>
<xml_diff>
--- a/Tuan1/NguyenVanKhaiTien_Tuan1.docx
+++ b/Tuan1/NguyenVanKhaiTien_Tuan1.docx
@@ -4,10 +4,419 @@
   <w:body>
     <w:p>
       <w:r>
-        <w:t>aaaa</w:t>
+        <w:t>Build</w:t>
+      </w:r>
+    </w:p>
+    <w:p>
+      <w:r>
+        <w:drawing>
+          <wp:inline distT="0" distB="0" distL="0" distR="0" wp14:anchorId="2130AE58" wp14:editId="0D9C1D86">
+            <wp:extent cx="5943600" cy="3343275"/>
+            <wp:effectExtent l="0" t="0" r="0" b="9525"/>
+            <wp:docPr id="1" name="Picture 1"/>
+            <wp:cNvGraphicFramePr>
+              <a:graphicFrameLocks xmlns:a="http://schemas.openxmlformats.org/drawingml/2006/main" noChangeAspect="1"/>
+            </wp:cNvGraphicFramePr>
+            <a:graphic xmlns:a="http://schemas.openxmlformats.org/drawingml/2006/main">
+              <a:graphicData uri="http://schemas.openxmlformats.org/drawingml/2006/picture">
+                <pic:pic xmlns:pic="http://schemas.openxmlformats.org/drawingml/2006/picture">
+                  <pic:nvPicPr>
+                    <pic:cNvPr id="1" name=""/>
+                    <pic:cNvPicPr/>
+                  </pic:nvPicPr>
+                  <pic:blipFill>
+                    <a:blip r:embed="rId4"/>
+                    <a:stretch>
+                      <a:fillRect/>
+                    </a:stretch>
+                  </pic:blipFill>
+                  <pic:spPr>
+                    <a:xfrm>
+                      <a:off x="0" y="0"/>
+                      <a:ext cx="5943600" cy="3343275"/>
+                    </a:xfrm>
+                    <a:prstGeom prst="rect">
+                      <a:avLst/>
+                    </a:prstGeom>
+                  </pic:spPr>
+                </pic:pic>
+              </a:graphicData>
+            </a:graphic>
+          </wp:inline>
+        </w:drawing>
+      </w:r>
+    </w:p>
+    <w:p>
+      <w:r>
+        <w:drawing>
+          <wp:inline distT="0" distB="0" distL="0" distR="0" wp14:anchorId="2FCA7B80" wp14:editId="05F0A270">
+            <wp:extent cx="5943600" cy="980440"/>
+            <wp:effectExtent l="0" t="0" r="0" b="0"/>
+            <wp:docPr id="4" name="Picture 4"/>
+            <wp:cNvGraphicFramePr>
+              <a:graphicFrameLocks xmlns:a="http://schemas.openxmlformats.org/drawingml/2006/main" noChangeAspect="1"/>
+            </wp:cNvGraphicFramePr>
+            <a:graphic xmlns:a="http://schemas.openxmlformats.org/drawingml/2006/main">
+              <a:graphicData uri="http://schemas.openxmlformats.org/drawingml/2006/picture">
+                <pic:pic xmlns:pic="http://schemas.openxmlformats.org/drawingml/2006/picture">
+                  <pic:nvPicPr>
+                    <pic:cNvPr id="1" name=""/>
+                    <pic:cNvPicPr/>
+                  </pic:nvPicPr>
+                  <pic:blipFill>
+                    <a:blip r:embed="rId5"/>
+                    <a:stretch>
+                      <a:fillRect/>
+                    </a:stretch>
+                  </pic:blipFill>
+                  <pic:spPr>
+                    <a:xfrm>
+                      <a:off x="0" y="0"/>
+                      <a:ext cx="5943600" cy="980440"/>
+                    </a:xfrm>
+                    <a:prstGeom prst="rect">
+                      <a:avLst/>
+                    </a:prstGeom>
+                  </pic:spPr>
+                </pic:pic>
+              </a:graphicData>
+            </a:graphic>
+          </wp:inline>
+        </w:drawing>
+      </w:r>
+    </w:p>
+    <w:p>
+      <w:r>
+        <w:t xml:space="preserve">Truong hop thanh cong: </w:t>
+      </w:r>
+    </w:p>
+    <w:p>
+      <w:r>
+        <w:lastRenderedPageBreak/>
+        <w:drawing>
+          <wp:inline distT="0" distB="0" distL="0" distR="0" wp14:anchorId="4F94F0F0" wp14:editId="203F19FE">
+            <wp:extent cx="5943600" cy="3383915"/>
+            <wp:effectExtent l="0" t="0" r="0" b="6985"/>
+            <wp:docPr id="2" name="Picture 2"/>
+            <wp:cNvGraphicFramePr>
+              <a:graphicFrameLocks xmlns:a="http://schemas.openxmlformats.org/drawingml/2006/main" noChangeAspect="1"/>
+            </wp:cNvGraphicFramePr>
+            <a:graphic xmlns:a="http://schemas.openxmlformats.org/drawingml/2006/main">
+              <a:graphicData uri="http://schemas.openxmlformats.org/drawingml/2006/picture">
+                <pic:pic xmlns:pic="http://schemas.openxmlformats.org/drawingml/2006/picture">
+                  <pic:nvPicPr>
+                    <pic:cNvPr id="1" name=""/>
+                    <pic:cNvPicPr/>
+                  </pic:nvPicPr>
+                  <pic:blipFill>
+                    <a:blip r:embed="rId6"/>
+                    <a:stretch>
+                      <a:fillRect/>
+                    </a:stretch>
+                  </pic:blipFill>
+                  <pic:spPr>
+                    <a:xfrm>
+                      <a:off x="0" y="0"/>
+                      <a:ext cx="5943600" cy="3383915"/>
+                    </a:xfrm>
+                    <a:prstGeom prst="rect">
+                      <a:avLst/>
+                    </a:prstGeom>
+                  </pic:spPr>
+                </pic:pic>
+              </a:graphicData>
+            </a:graphic>
+          </wp:inline>
+        </w:drawing>
+      </w:r>
+    </w:p>
+    <w:p>
+      <w:r>
+        <w:drawing>
+          <wp:inline distT="0" distB="0" distL="0" distR="0" wp14:anchorId="0528335F" wp14:editId="352F6EE5">
+            <wp:extent cx="5943600" cy="3390900"/>
+            <wp:effectExtent l="0" t="0" r="0" b="0"/>
+            <wp:docPr id="3" name="Picture 3"/>
+            <wp:cNvGraphicFramePr>
+              <a:graphicFrameLocks xmlns:a="http://schemas.openxmlformats.org/drawingml/2006/main" noChangeAspect="1"/>
+            </wp:cNvGraphicFramePr>
+            <a:graphic xmlns:a="http://schemas.openxmlformats.org/drawingml/2006/main">
+              <a:graphicData uri="http://schemas.openxmlformats.org/drawingml/2006/picture">
+                <pic:pic xmlns:pic="http://schemas.openxmlformats.org/drawingml/2006/picture">
+                  <pic:nvPicPr>
+                    <pic:cNvPr id="1" name=""/>
+                    <pic:cNvPicPr/>
+                  </pic:nvPicPr>
+                  <pic:blipFill>
+                    <a:blip r:embed="rId7"/>
+                    <a:stretch>
+                      <a:fillRect/>
+                    </a:stretch>
+                  </pic:blipFill>
+                  <pic:spPr>
+                    <a:xfrm>
+                      <a:off x="0" y="0"/>
+                      <a:ext cx="5943600" cy="3390900"/>
+                    </a:xfrm>
+                    <a:prstGeom prst="rect">
+                      <a:avLst/>
+                    </a:prstGeom>
+                  </pic:spPr>
+                </pic:pic>
+              </a:graphicData>
+            </a:graphic>
+          </wp:inline>
+        </w:drawing>
+      </w:r>
+    </w:p>
+    <w:p>
+      <w:r>
+        <w:lastRenderedPageBreak/>
+        <w:drawing>
+          <wp:inline distT="0" distB="0" distL="0" distR="0" wp14:anchorId="58E8E427" wp14:editId="45F1A385">
+            <wp:extent cx="5943600" cy="1899920"/>
+            <wp:effectExtent l="0" t="0" r="0" b="5080"/>
+            <wp:docPr id="5" name="Picture 5"/>
+            <wp:cNvGraphicFramePr>
+              <a:graphicFrameLocks xmlns:a="http://schemas.openxmlformats.org/drawingml/2006/main" noChangeAspect="1"/>
+            </wp:cNvGraphicFramePr>
+            <a:graphic xmlns:a="http://schemas.openxmlformats.org/drawingml/2006/main">
+              <a:graphicData uri="http://schemas.openxmlformats.org/drawingml/2006/picture">
+                <pic:pic xmlns:pic="http://schemas.openxmlformats.org/drawingml/2006/picture">
+                  <pic:nvPicPr>
+                    <pic:cNvPr id="1" name=""/>
+                    <pic:cNvPicPr/>
+                  </pic:nvPicPr>
+                  <pic:blipFill>
+                    <a:blip r:embed="rId8"/>
+                    <a:stretch>
+                      <a:fillRect/>
+                    </a:stretch>
+                  </pic:blipFill>
+                  <pic:spPr>
+                    <a:xfrm>
+                      <a:off x="0" y="0"/>
+                      <a:ext cx="5943600" cy="1899920"/>
+                    </a:xfrm>
+                    <a:prstGeom prst="rect">
+                      <a:avLst/>
+                    </a:prstGeom>
+                  </pic:spPr>
+                </pic:pic>
+              </a:graphicData>
+            </a:graphic>
+          </wp:inline>
+        </w:drawing>
+      </w:r>
+    </w:p>
+    <w:p/>
+    <w:p>
+      <w:r>
+        <w:t>Truong hop loi:</w:t>
+      </w:r>
+    </w:p>
+    <w:p>
+      <w:r>
+        <w:drawing>
+          <wp:inline distT="0" distB="0" distL="0" distR="0" wp14:anchorId="6CEA2A19" wp14:editId="2E63F1B9">
+            <wp:extent cx="5943600" cy="3343275"/>
+            <wp:effectExtent l="0" t="0" r="0" b="9525"/>
+            <wp:docPr id="6" name="Picture 6"/>
+            <wp:cNvGraphicFramePr>
+              <a:graphicFrameLocks xmlns:a="http://schemas.openxmlformats.org/drawingml/2006/main" noChangeAspect="1"/>
+            </wp:cNvGraphicFramePr>
+            <a:graphic xmlns:a="http://schemas.openxmlformats.org/drawingml/2006/main">
+              <a:graphicData uri="http://schemas.openxmlformats.org/drawingml/2006/picture">
+                <pic:pic xmlns:pic="http://schemas.openxmlformats.org/drawingml/2006/picture">
+                  <pic:nvPicPr>
+                    <pic:cNvPr id="1" name=""/>
+                    <pic:cNvPicPr/>
+                  </pic:nvPicPr>
+                  <pic:blipFill>
+                    <a:blip r:embed="rId9"/>
+                    <a:stretch>
+                      <a:fillRect/>
+                    </a:stretch>
+                  </pic:blipFill>
+                  <pic:spPr>
+                    <a:xfrm>
+                      <a:off x="0" y="0"/>
+                      <a:ext cx="5943600" cy="3343275"/>
+                    </a:xfrm>
+                    <a:prstGeom prst="rect">
+                      <a:avLst/>
+                    </a:prstGeom>
+                  </pic:spPr>
+                </pic:pic>
+              </a:graphicData>
+            </a:graphic>
+          </wp:inline>
+        </w:drawing>
+      </w:r>
+    </w:p>
+    <w:p>
+      <w:r>
+        <w:lastRenderedPageBreak/>
+        <w:drawing>
+          <wp:inline distT="0" distB="0" distL="0" distR="0" wp14:anchorId="4113C3AF" wp14:editId="3AEDA31D">
+            <wp:extent cx="5943600" cy="2764155"/>
+            <wp:effectExtent l="0" t="0" r="0" b="0"/>
+            <wp:docPr id="10" name="Picture 10"/>
+            <wp:cNvGraphicFramePr>
+              <a:graphicFrameLocks xmlns:a="http://schemas.openxmlformats.org/drawingml/2006/main" noChangeAspect="1"/>
+            </wp:cNvGraphicFramePr>
+            <a:graphic xmlns:a="http://schemas.openxmlformats.org/drawingml/2006/main">
+              <a:graphicData uri="http://schemas.openxmlformats.org/drawingml/2006/picture">
+                <pic:pic xmlns:pic="http://schemas.openxmlformats.org/drawingml/2006/picture">
+                  <pic:nvPicPr>
+                    <pic:cNvPr id="1" name=""/>
+                    <pic:cNvPicPr/>
+                  </pic:nvPicPr>
+                  <pic:blipFill>
+                    <a:blip r:embed="rId10"/>
+                    <a:stretch>
+                      <a:fillRect/>
+                    </a:stretch>
+                  </pic:blipFill>
+                  <pic:spPr>
+                    <a:xfrm>
+                      <a:off x="0" y="0"/>
+                      <a:ext cx="5943600" cy="2764155"/>
+                    </a:xfrm>
+                    <a:prstGeom prst="rect">
+                      <a:avLst/>
+                    </a:prstGeom>
+                  </pic:spPr>
+                </pic:pic>
+              </a:graphicData>
+            </a:graphic>
+          </wp:inline>
+        </w:drawing>
       </w:r>
       <w:bookmarkStart w:id="0" w:name="_GoBack"/>
       <w:bookmarkEnd w:id="0"/>
+    </w:p>
+    <w:p>
+      <w:r>
+        <w:drawing>
+          <wp:inline distT="0" distB="0" distL="0" distR="0" wp14:anchorId="40BD5760" wp14:editId="0FB96275">
+            <wp:extent cx="5943600" cy="3354070"/>
+            <wp:effectExtent l="0" t="0" r="0" b="0"/>
+            <wp:docPr id="7" name="Picture 7"/>
+            <wp:cNvGraphicFramePr>
+              <a:graphicFrameLocks xmlns:a="http://schemas.openxmlformats.org/drawingml/2006/main" noChangeAspect="1"/>
+            </wp:cNvGraphicFramePr>
+            <a:graphic xmlns:a="http://schemas.openxmlformats.org/drawingml/2006/main">
+              <a:graphicData uri="http://schemas.openxmlformats.org/drawingml/2006/picture">
+                <pic:pic xmlns:pic="http://schemas.openxmlformats.org/drawingml/2006/picture">
+                  <pic:nvPicPr>
+                    <pic:cNvPr id="1" name=""/>
+                    <pic:cNvPicPr/>
+                  </pic:nvPicPr>
+                  <pic:blipFill>
+                    <a:blip r:embed="rId11"/>
+                    <a:stretch>
+                      <a:fillRect/>
+                    </a:stretch>
+                  </pic:blipFill>
+                  <pic:spPr>
+                    <a:xfrm>
+                      <a:off x="0" y="0"/>
+                      <a:ext cx="5943600" cy="3354070"/>
+                    </a:xfrm>
+                    <a:prstGeom prst="rect">
+                      <a:avLst/>
+                    </a:prstGeom>
+                  </pic:spPr>
+                </pic:pic>
+              </a:graphicData>
+            </a:graphic>
+          </wp:inline>
+        </w:drawing>
+      </w:r>
+    </w:p>
+    <w:p/>
+    <w:p>
+      <w:r>
+        <w:lastRenderedPageBreak/>
+        <w:t>Lenh down</w:t>
+      </w:r>
+      <w:r>
+        <w:drawing>
+          <wp:inline distT="0" distB="0" distL="0" distR="0" wp14:anchorId="3C70DB1E" wp14:editId="02DA2169">
+            <wp:extent cx="5943600" cy="3343275"/>
+            <wp:effectExtent l="0" t="0" r="0" b="9525"/>
+            <wp:docPr id="9" name="Picture 9"/>
+            <wp:cNvGraphicFramePr>
+              <a:graphicFrameLocks xmlns:a="http://schemas.openxmlformats.org/drawingml/2006/main" noChangeAspect="1"/>
+            </wp:cNvGraphicFramePr>
+            <a:graphic xmlns:a="http://schemas.openxmlformats.org/drawingml/2006/main">
+              <a:graphicData uri="http://schemas.openxmlformats.org/drawingml/2006/picture">
+                <pic:pic xmlns:pic="http://schemas.openxmlformats.org/drawingml/2006/picture">
+                  <pic:nvPicPr>
+                    <pic:cNvPr id="1" name=""/>
+                    <pic:cNvPicPr/>
+                  </pic:nvPicPr>
+                  <pic:blipFill>
+                    <a:blip r:embed="rId12"/>
+                    <a:stretch>
+                      <a:fillRect/>
+                    </a:stretch>
+                  </pic:blipFill>
+                  <pic:spPr>
+                    <a:xfrm>
+                      <a:off x="0" y="0"/>
+                      <a:ext cx="5943600" cy="3343275"/>
+                    </a:xfrm>
+                    <a:prstGeom prst="rect">
+                      <a:avLst/>
+                    </a:prstGeom>
+                  </pic:spPr>
+                </pic:pic>
+              </a:graphicData>
+            </a:graphic>
+          </wp:inline>
+        </w:drawing>
+      </w:r>
+    </w:p>
+    <w:p>
+      <w:r>
+        <w:drawing>
+          <wp:inline distT="0" distB="0" distL="0" distR="0" wp14:anchorId="4C79D50E" wp14:editId="343D2B65">
+            <wp:extent cx="5943600" cy="3343275"/>
+            <wp:effectExtent l="0" t="0" r="0" b="9525"/>
+            <wp:docPr id="8" name="Picture 8"/>
+            <wp:cNvGraphicFramePr>
+              <a:graphicFrameLocks xmlns:a="http://schemas.openxmlformats.org/drawingml/2006/main" noChangeAspect="1"/>
+            </wp:cNvGraphicFramePr>
+            <a:graphic xmlns:a="http://schemas.openxmlformats.org/drawingml/2006/main">
+              <a:graphicData uri="http://schemas.openxmlformats.org/drawingml/2006/picture">
+                <pic:pic xmlns:pic="http://schemas.openxmlformats.org/drawingml/2006/picture">
+                  <pic:nvPicPr>
+                    <pic:cNvPr id="1" name=""/>
+                    <pic:cNvPicPr/>
+                  </pic:nvPicPr>
+                  <pic:blipFill>
+                    <a:blip r:embed="rId13"/>
+                    <a:stretch>
+                      <a:fillRect/>
+                    </a:stretch>
+                  </pic:blipFill>
+                  <pic:spPr>
+                    <a:xfrm>
+                      <a:off x="0" y="0"/>
+                      <a:ext cx="5943600" cy="3343275"/>
+                    </a:xfrm>
+                    <a:prstGeom prst="rect">
+                      <a:avLst/>
+                    </a:prstGeom>
+                  </pic:spPr>
+                </pic:pic>
+              </a:graphicData>
+            </a:graphic>
+          </wp:inline>
+        </w:drawing>
+      </w:r>
     </w:p>
     <w:sectPr>
       <w:pgSz w:w="12240" w:h="15840"/>

</xml_diff>